<commit_message>
final version of hw1
</commit_message>
<xml_diff>
--- a/HW1/24127095_linux_assignment.docx
+++ b/HW1/24127095_linux_assignment.docx
@@ -323,25 +323,7 @@
           <w:sz w:val="21"/>
           <w:szCs w:val="21"/>
         </w:rPr>
-        <w:t xml:space="preserve">A screenshot with no explanation, or an explanation with no screenshot, earns no </w:t>
-      </w:r>
-      <w:proofErr w:type="gramStart"/>
-      <w:r>
-        <w:rPr>
-          <w:rFonts w:ascii="Times New Roman" w:hAnsi="Times New Roman" w:cs="Times New Roman"/>
-          <w:sz w:val="21"/>
-          <w:szCs w:val="21"/>
-        </w:rPr>
-        <w:t>marks</w:t>
-      </w:r>
-      <w:proofErr w:type="gramEnd"/>
-      <w:r>
-        <w:rPr>
-          <w:rFonts w:ascii="Times New Roman" w:hAnsi="Times New Roman" w:cs="Times New Roman"/>
-          <w:sz w:val="21"/>
-          <w:szCs w:val="21"/>
-        </w:rPr>
-        <w:t xml:space="preserve"> for that question. The screenshot must show your own environment (your username/prompt visible is ideal).</w:t>
+        <w:t>A screenshot with no explanation, or an explanation with no screenshot, earns no marks for that question. The screenshot must show your own environment (your username/prompt visible is ideal).</w:t>
       </w:r>
     </w:p>
     <w:p>
@@ -2207,7 +2189,21 @@
               <w:rPr>
                 <w:rFonts w:ascii="Times New Roman" w:hAnsi="Times New Roman" w:cs="Times New Roman"/>
               </w:rPr>
-              <w:t xml:space="preserve"> in that file is 183 lines because </w:t>
+              <w:t xml:space="preserve"> in that file </w:t>
+            </w:r>
+            <w:proofErr w:type="gramStart"/>
+            <w:r>
+              <w:rPr>
+                <w:rFonts w:ascii="Times New Roman" w:hAnsi="Times New Roman" w:cs="Times New Roman"/>
+              </w:rPr>
+              <w:t>is</w:t>
+            </w:r>
+            <w:proofErr w:type="gramEnd"/>
+            <w:r>
+              <w:rPr>
+                <w:rFonts w:ascii="Times New Roman" w:hAnsi="Times New Roman" w:cs="Times New Roman"/>
+              </w:rPr>
+              <w:t xml:space="preserve"> 183 lines because </w:t>
             </w:r>
             <w:r>
               <w:rPr>
@@ -2486,7 +2482,27 @@
                 <w:i/>
                 <w:iCs/>
               </w:rPr>
-              <w:t>head -n 1 data/messy_sales.csv</w:t>
+              <w:t>head -n 1 data/</w:t>
+            </w:r>
+            <w:r>
+              <w:rPr>
+                <w:rFonts w:ascii="Times New Roman" w:hAnsi="Times New Roman" w:cs="Times New Roman"/>
+                <w:b/>
+                <w:bCs/>
+                <w:i/>
+                <w:iCs/>
+              </w:rPr>
+              <w:t>sales_messy</w:t>
+            </w:r>
+            <w:r>
+              <w:rPr>
+                <w:rFonts w:ascii="Times New Roman" w:hAnsi="Times New Roman" w:cs="Times New Roman"/>
+                <w:b/>
+                <w:bCs/>
+                <w:i/>
+                <w:iCs/>
+              </w:rPr>
+              <w:t>.csv</w:t>
             </w:r>
             <w:r>
               <w:rPr>
@@ -2624,7 +2640,77 @@
                 <w:i/>
                 <w:iCs/>
               </w:rPr>
-              <w:t xml:space="preserve"> ‘,’ ‘\n’</w:t>
+              <w:t xml:space="preserve"> </w:t>
+            </w:r>
+            <w:r>
+              <w:rPr>
+                <w:rFonts w:ascii="Times New Roman" w:hAnsi="Times New Roman" w:cs="Times New Roman"/>
+                <w:b/>
+                <w:bCs/>
+                <w:i/>
+                <w:iCs/>
+              </w:rPr>
+              <w:t>'</w:t>
+            </w:r>
+            <w:r>
+              <w:rPr>
+                <w:rFonts w:ascii="Times New Roman" w:hAnsi="Times New Roman" w:cs="Times New Roman"/>
+                <w:b/>
+                <w:bCs/>
+                <w:i/>
+                <w:iCs/>
+              </w:rPr>
+              <w:t>,</w:t>
+            </w:r>
+            <w:r>
+              <w:rPr>
+                <w:rFonts w:ascii="Times New Roman" w:hAnsi="Times New Roman" w:cs="Times New Roman"/>
+                <w:b/>
+                <w:bCs/>
+                <w:i/>
+                <w:iCs/>
+              </w:rPr>
+              <w:t>'</w:t>
+            </w:r>
+            <w:r>
+              <w:rPr>
+                <w:rFonts w:ascii="Times New Roman" w:hAnsi="Times New Roman" w:cs="Times New Roman"/>
+                <w:b/>
+                <w:bCs/>
+                <w:i/>
+                <w:iCs/>
+              </w:rPr>
+              <w:t xml:space="preserve"> </w:t>
+            </w:r>
+            <w:r>
+              <w:rPr>
+                <w:rFonts w:ascii="Times New Roman" w:hAnsi="Times New Roman" w:cs="Times New Roman"/>
+                <w:b/>
+                <w:bCs/>
+                <w:i/>
+                <w:iCs/>
+              </w:rPr>
+              <w:t>'</w:t>
+            </w:r>
+            <w:r>
+              <w:rPr>
+                <w:rFonts w:ascii="Times New Roman" w:hAnsi="Times New Roman" w:cs="Times New Roman"/>
+                <w:b/>
+                <w:bCs/>
+                <w:i/>
+                <w:iCs/>
+              </w:rPr>
+              <w:t>\n</w:t>
+            </w:r>
+            <w:r>
+              <w:rPr>
+                <w:rFonts w:ascii="Times New Roman" w:hAnsi="Times New Roman" w:cs="Times New Roman"/>
+                <w:b/>
+                <w:bCs/>
+                <w:i/>
+                <w:iCs/>
+              </w:rPr>
+              <w:t>'</w:t>
             </w:r>
             <w:r>
               <w:rPr>
@@ -3254,6 +3340,35 @@
               <w:rPr>
                 <w:rFonts w:ascii="Times New Roman" w:hAnsi="Times New Roman" w:cs="Times New Roman"/>
               </w:rPr>
+              <w:t xml:space="preserve">The command </w:t>
+            </w:r>
+            <w:r>
+              <w:rPr>
+                <w:rFonts w:ascii="Times New Roman" w:hAnsi="Times New Roman" w:cs="Times New Roman"/>
+                <w:b/>
+                <w:bCs/>
+                <w:i/>
+                <w:iCs/>
+              </w:rPr>
+              <w:t>tail -n 5 data/sales_messy.csv</w:t>
+            </w:r>
+            <w:r>
+              <w:rPr>
+                <w:rFonts w:ascii="Times New Roman" w:hAnsi="Times New Roman" w:cs="Times New Roman"/>
+              </w:rPr>
+              <w:t xml:space="preserve"> prints the last 5 lines of the file (-n 5 sets the number of lines).</w:t>
+            </w:r>
+          </w:p>
+          <w:p>
+            <w:pPr>
+              <w:rPr>
+                <w:rFonts w:ascii="Times New Roman" w:hAnsi="Times New Roman" w:cs="Times New Roman"/>
+              </w:rPr>
+            </w:pPr>
+            <w:r>
+              <w:rPr>
+                <w:rFonts w:ascii="Times New Roman" w:hAnsi="Times New Roman" w:cs="Times New Roman"/>
+              </w:rPr>
               <w:t xml:space="preserve">In last 5 rows, there are some </w:t>
             </w:r>
             <w:proofErr w:type="gramStart"/>
@@ -3462,7 +3577,13 @@
               <w:rPr>
                 <w:rFonts w:ascii="Times New Roman" w:hAnsi="Times New Roman" w:cs="Times New Roman"/>
               </w:rPr>
-              <w:t xml:space="preserve">written entirely in uppercase, whereas the other product names </w:t>
+              <w:t>fully uppercase and the string ‘monitor’ in the fifth line is fully lowercase</w:t>
+            </w:r>
+            <w:r>
+              <w:rPr>
+                <w:rFonts w:ascii="Times New Roman" w:hAnsi="Times New Roman" w:cs="Times New Roman"/>
+              </w:rPr>
+              <w:t xml:space="preserve">, whereas the other product names </w:t>
             </w:r>
             <w:r>
               <w:rPr>
@@ -3779,7 +3900,7 @@
                 <w:i/>
                 <w:iCs/>
               </w:rPr>
-              <w:t>‘</w:t>
+              <w:t>'</w:t>
             </w:r>
             <w:r>
               <w:rPr>
@@ -3799,17 +3920,27 @@
                 <w:i/>
                 <w:iCs/>
               </w:rPr>
-              <w:t>’</w:t>
-            </w:r>
-            <w:r>
-              <w:rPr>
-                <w:rFonts w:ascii="Times New Roman" w:hAnsi="Times New Roman" w:cs="Times New Roman"/>
-                <w:b/>
-                <w:bCs/>
-                <w:i/>
-                <w:iCs/>
-              </w:rPr>
-              <w:t xml:space="preserve"> -f 9 data/sales_messy.cs</w:t>
+              <w:t>'</w:t>
+            </w:r>
+            <w:r>
+              <w:rPr>
+                <w:rFonts w:ascii="Times New Roman" w:hAnsi="Times New Roman" w:cs="Times New Roman"/>
+                <w:b/>
+                <w:bCs/>
+                <w:i/>
+                <w:iCs/>
+              </w:rPr>
+              <w:t xml:space="preserve"> </w:t>
+            </w:r>
+            <w:r>
+              <w:rPr>
+                <w:rFonts w:ascii="Times New Roman" w:hAnsi="Times New Roman" w:cs="Times New Roman"/>
+                <w:b/>
+                <w:bCs/>
+                <w:i/>
+                <w:iCs/>
+              </w:rPr>
+              <w:t>-f 9 data/sales_messy.cs</w:t>
             </w:r>
             <w:r>
               <w:rPr>
@@ -3866,33 +3997,23 @@
                 <w:i/>
                 <w:iCs/>
               </w:rPr>
-              <w:t>“</w:t>
-            </w:r>
-            <w:r>
-              <w:rPr>
-                <w:rFonts w:ascii="Times New Roman" w:hAnsi="Times New Roman" w:cs="Times New Roman"/>
-                <w:b/>
-                <w:bCs/>
-                <w:i/>
-                <w:iCs/>
-              </w:rPr>
-              <w:t>cancelled</w:t>
-            </w:r>
-            <w:r>
-              <w:rPr>
-                <w:rFonts w:ascii="Times New Roman" w:hAnsi="Times New Roman" w:cs="Times New Roman"/>
-                <w:b/>
-                <w:bCs/>
-                <w:i/>
-                <w:iCs/>
-              </w:rPr>
-              <w:t>”</w:t>
-            </w:r>
-            <w:r>
-              <w:rPr>
-                <w:rFonts w:ascii="Times New Roman" w:hAnsi="Times New Roman" w:cs="Times New Roman"/>
-              </w:rPr>
-              <w:t xml:space="preserve"> filters the output, keeping only lines that match the exact string </w:t>
+              <w:t>"cancelled"</w:t>
+            </w:r>
+            <w:r>
+              <w:rPr>
+                <w:rFonts w:ascii="Times New Roman" w:hAnsi="Times New Roman" w:cs="Times New Roman"/>
+                <w:b/>
+                <w:bCs/>
+                <w:i/>
+                <w:iCs/>
+              </w:rPr>
+              <w:t xml:space="preserve"> </w:t>
+            </w:r>
+            <w:r>
+              <w:rPr>
+                <w:rFonts w:ascii="Times New Roman" w:hAnsi="Times New Roman" w:cs="Times New Roman"/>
+              </w:rPr>
+              <w:t xml:space="preserve">filters the output, keeping only lines that match the exact string </w:t>
             </w:r>
             <w:r>
               <w:rPr>
@@ -4283,7 +4404,7 @@
                 <w:i/>
                 <w:iCs/>
               </w:rPr>
-              <w:t>‘</w:t>
+              <w:t>'</w:t>
             </w:r>
             <w:r>
               <w:rPr>
@@ -4303,7 +4424,7 @@
                 <w:i/>
                 <w:iCs/>
               </w:rPr>
-              <w:t>’</w:t>
+              <w:t>'</w:t>
             </w:r>
             <w:r>
               <w:rPr>
@@ -4636,19 +4757,13 @@
             <w:r>
               <w:rPr>
                 <w:rFonts w:ascii="Times New Roman" w:hAnsi="Times New Roman" w:cs="Times New Roman"/>
-                <w:i/>
-                <w:iCs/>
-                <w:noProof/>
-                <w:color w:val="999999"/>
-                <w:sz w:val="18"/>
-                <w:szCs w:val="18"/>
               </w:rPr>
               <w:lastRenderedPageBreak/>
               <w:drawing>
-                <wp:inline distT="0" distB="0" distL="0" distR="0" wp14:anchorId="470C2610" wp14:editId="381D1F30">
-                  <wp:extent cx="5731510" cy="3221990"/>
+                <wp:inline distT="0" distB="0" distL="0" distR="0" wp14:anchorId="4C7D15C4" wp14:editId="75B8E547">
+                  <wp:extent cx="5731510" cy="3222625"/>
                   <wp:effectExtent l="0" t="0" r="2540" b="0"/>
-                  <wp:docPr id="500175768" name="Picture 1"/>
+                  <wp:docPr id="1737114864" name="Picture 1"/>
                   <wp:cNvGraphicFramePr>
                     <a:graphicFrameLocks xmlns:a="http://schemas.openxmlformats.org/drawingml/2006/main" noChangeAspect="1"/>
                   </wp:cNvGraphicFramePr>
@@ -4656,7 +4771,7 @@
                     <a:graphicData uri="http://schemas.openxmlformats.org/drawingml/2006/picture">
                       <pic:pic xmlns:pic="http://schemas.openxmlformats.org/drawingml/2006/picture">
                         <pic:nvPicPr>
-                          <pic:cNvPr id="500175768" name=""/>
+                          <pic:cNvPr id="1737114864" name=""/>
                           <pic:cNvPicPr/>
                         </pic:nvPicPr>
                         <pic:blipFill>
@@ -4668,7 +4783,7 @@
                         <pic:spPr>
                           <a:xfrm>
                             <a:off x="0" y="0"/>
-                            <a:ext cx="5731510" cy="3221990"/>
+                            <a:ext cx="5731510" cy="3222625"/>
                           </a:xfrm>
                           <a:prstGeom prst="rect">
                             <a:avLst/>
@@ -4757,7 +4872,6 @@
                 <w:numId w:val="13"/>
               </w:numPr>
               <w:spacing w:before="60"/>
-              <w:jc w:val="both"/>
               <w:rPr>
                 <w:rFonts w:ascii="Times New Roman" w:hAnsi="Times New Roman" w:cs="Times New Roman"/>
               </w:rPr>
@@ -4776,7 +4890,7 @@
                 <w:i/>
                 <w:iCs/>
               </w:rPr>
-              <w:t xml:space="preserve">grep </w:t>
+              <w:t>grep -E '(</w:t>
             </w:r>
             <w:proofErr w:type="gramStart"/>
             <w:r>
@@ -4787,17 +4901,7 @@
                 <w:i/>
                 <w:iCs/>
               </w:rPr>
-              <w:t>“</w:t>
-            </w:r>
-            <w:r>
-              <w:rPr>
-                <w:rFonts w:ascii="Times New Roman" w:hAnsi="Times New Roman" w:cs="Times New Roman"/>
-                <w:b/>
-                <w:bCs/>
-                <w:i/>
-                <w:iCs/>
-              </w:rPr>
-              <w:t>,,</w:t>
+              <w:t>^,|,,|,$</w:t>
             </w:r>
             <w:proofErr w:type="gramEnd"/>
             <w:r>
@@ -4808,49 +4912,115 @@
                 <w:i/>
                 <w:iCs/>
               </w:rPr>
-              <w:t>”</w:t>
-            </w:r>
-            <w:r>
-              <w:rPr>
-                <w:rFonts w:ascii="Times New Roman" w:hAnsi="Times New Roman" w:cs="Times New Roman"/>
-                <w:b/>
-                <w:bCs/>
-                <w:i/>
-                <w:iCs/>
-              </w:rPr>
-              <w:t xml:space="preserve"> data/sales_messy.csv</w:t>
-            </w:r>
-            <w:r>
-              <w:rPr>
-                <w:rFonts w:ascii="Times New Roman" w:hAnsi="Times New Roman" w:cs="Times New Roman"/>
-              </w:rPr>
-              <w:t xml:space="preserve"> is used to filter rows containing the pattern </w:t>
+              <w:t>)' data/sales_messy.csv</w:t>
+            </w:r>
+            <w:r>
+              <w:rPr>
+                <w:rFonts w:ascii="Times New Roman" w:hAnsi="Times New Roman" w:cs="Times New Roman"/>
+              </w:rPr>
+              <w:t xml:space="preserve"> filters the rows that contain an empty field. </w:t>
             </w:r>
             <w:proofErr w:type="gramStart"/>
             <w:r>
               <w:rPr>
                 <w:rFonts w:ascii="Times New Roman" w:hAnsi="Times New Roman" w:cs="Times New Roman"/>
               </w:rPr>
-              <w:t>“</w:t>
-            </w:r>
-            <w:r>
-              <w:rPr>
-                <w:rFonts w:ascii="Times New Roman" w:hAnsi="Times New Roman" w:cs="Times New Roman"/>
-              </w:rPr>
-              <w:t>,,</w:t>
+              <w:t>The flag</w:t>
             </w:r>
             <w:proofErr w:type="gramEnd"/>
             <w:r>
               <w:rPr>
                 <w:rFonts w:ascii="Times New Roman" w:hAnsi="Times New Roman" w:cs="Times New Roman"/>
               </w:rPr>
-              <w:t>”</w:t>
-            </w:r>
-            <w:r>
-              <w:rPr>
-                <w:rFonts w:ascii="Times New Roman" w:hAnsi="Times New Roman" w:cs="Times New Roman"/>
-              </w:rPr>
-              <w:t>, which indicates an empty field in the CSV file.</w:t>
+              <w:t xml:space="preserve"> -E enables extended regular expressions, so the alternation operator | and the group </w:t>
+            </w:r>
+            <w:proofErr w:type="gramStart"/>
+            <w:r>
+              <w:rPr>
+                <w:rFonts w:ascii="Times New Roman" w:hAnsi="Times New Roman" w:cs="Times New Roman"/>
+              </w:rPr>
+              <w:t>( )</w:t>
+            </w:r>
+            <w:proofErr w:type="gramEnd"/>
+            <w:r>
+              <w:rPr>
+                <w:rFonts w:ascii="Times New Roman" w:hAnsi="Times New Roman" w:cs="Times New Roman"/>
+              </w:rPr>
+              <w:t xml:space="preserve"> can be used without backslashes. The pattern has three alternatives: </w:t>
+            </w:r>
+            <w:r>
+              <w:rPr>
+                <w:rFonts w:ascii="Times New Roman" w:hAnsi="Times New Roman" w:cs="Times New Roman"/>
+                <w:b/>
+                <w:bCs/>
+              </w:rPr>
+              <w:t>^,</w:t>
+            </w:r>
+            <w:r>
+              <w:rPr>
+                <w:rFonts w:ascii="Times New Roman" w:hAnsi="Times New Roman" w:cs="Times New Roman"/>
+              </w:rPr>
+              <w:t xml:space="preserve"> matches a comma at the beginning of a line (empty first field)</w:t>
+            </w:r>
+            <w:proofErr w:type="gramStart"/>
+            <w:r>
+              <w:rPr>
+                <w:rFonts w:ascii="Times New Roman" w:hAnsi="Times New Roman" w:cs="Times New Roman"/>
+              </w:rPr>
+              <w:t xml:space="preserve">, </w:t>
+            </w:r>
+            <w:r>
+              <w:rPr>
+                <w:rFonts w:ascii="Times New Roman" w:hAnsi="Times New Roman" w:cs="Times New Roman"/>
+                <w:b/>
+                <w:bCs/>
+              </w:rPr>
+              <w:t>,</w:t>
+            </w:r>
+            <w:proofErr w:type="gramEnd"/>
+            <w:r>
+              <w:rPr>
+                <w:rFonts w:ascii="Times New Roman" w:hAnsi="Times New Roman" w:cs="Times New Roman"/>
+                <w:b/>
+                <w:bCs/>
+              </w:rPr>
+              <w:t>,</w:t>
+            </w:r>
+            <w:r>
+              <w:rPr>
+                <w:rFonts w:ascii="Times New Roman" w:hAnsi="Times New Roman" w:cs="Times New Roman"/>
+              </w:rPr>
+              <w:t xml:space="preserve"> matches two consecutive commas (empty field in the middle), </w:t>
+            </w:r>
+            <w:proofErr w:type="gramStart"/>
+            <w:r>
+              <w:rPr>
+                <w:rFonts w:ascii="Times New Roman" w:hAnsi="Times New Roman" w:cs="Times New Roman"/>
+              </w:rPr>
+              <w:t xml:space="preserve">and </w:t>
+            </w:r>
+            <w:r>
+              <w:rPr>
+                <w:rFonts w:ascii="Times New Roman" w:hAnsi="Times New Roman" w:cs="Times New Roman"/>
+                <w:b/>
+                <w:bCs/>
+              </w:rPr>
+              <w:t>,</w:t>
+            </w:r>
+            <w:proofErr w:type="gramEnd"/>
+            <w:r>
+              <w:rPr>
+                <w:rFonts w:ascii="Times New Roman" w:hAnsi="Times New Roman" w:cs="Times New Roman"/>
+                <w:b/>
+                <w:bCs/>
+              </w:rPr>
+              <w:t>$</w:t>
+            </w:r>
+            <w:r>
+              <w:rPr>
+                <w:rFonts w:ascii="Times New Roman" w:hAnsi="Times New Roman" w:cs="Times New Roman"/>
+              </w:rPr>
+              <w:t xml:space="preserve"> matches a comma at the end of a line (empty last field).</w:t>
             </w:r>
           </w:p>
           <w:p>
@@ -4866,6 +5036,12 @@
                 <w:rFonts w:ascii="Times New Roman" w:hAnsi="Times New Roman" w:cs="Times New Roman"/>
               </w:rPr>
             </w:pPr>
+            <w:r>
+              <w:rPr>
+                <w:rFonts w:ascii="Times New Roman" w:hAnsi="Times New Roman" w:cs="Times New Roman"/>
+              </w:rPr>
+              <w:t xml:space="preserve"> </w:t>
+            </w:r>
             <w:proofErr w:type="spellStart"/>
             <w:r>
               <w:rPr>
@@ -5027,18 +5203,13 @@
             <w:r>
               <w:rPr>
                 <w:rFonts w:ascii="Times New Roman" w:hAnsi="Times New Roman" w:cs="Times New Roman"/>
-                <w:i/>
-                <w:iCs/>
-                <w:noProof/>
-                <w:color w:val="999999"/>
-                <w:sz w:val="18"/>
-                <w:szCs w:val="18"/>
-              </w:rPr>
+              </w:rPr>
+              <w:lastRenderedPageBreak/>
               <w:drawing>
-                <wp:inline distT="0" distB="0" distL="0" distR="0" wp14:anchorId="40D70879" wp14:editId="146CE0CD">
-                  <wp:extent cx="5731510" cy="3228340"/>
+                <wp:inline distT="0" distB="0" distL="0" distR="0" wp14:anchorId="24137617" wp14:editId="19A60B07">
+                  <wp:extent cx="5731510" cy="3222625"/>
                   <wp:effectExtent l="0" t="0" r="2540" b="0"/>
-                  <wp:docPr id="433201779" name="Picture 1"/>
+                  <wp:docPr id="1593122635" name="Picture 1"/>
                   <wp:cNvGraphicFramePr>
                     <a:graphicFrameLocks xmlns:a="http://schemas.openxmlformats.org/drawingml/2006/main" noChangeAspect="1"/>
                   </wp:cNvGraphicFramePr>
@@ -5046,7 +5217,7 @@
                     <a:graphicData uri="http://schemas.openxmlformats.org/drawingml/2006/picture">
                       <pic:pic xmlns:pic="http://schemas.openxmlformats.org/drawingml/2006/picture">
                         <pic:nvPicPr>
-                          <pic:cNvPr id="433201779" name=""/>
+                          <pic:cNvPr id="1593122635" name=""/>
                           <pic:cNvPicPr/>
                         </pic:nvPicPr>
                         <pic:blipFill>
@@ -5058,7 +5229,7 @@
                         <pic:spPr>
                           <a:xfrm>
                             <a:off x="0" y="0"/>
-                            <a:ext cx="5731510" cy="3228340"/>
+                            <a:ext cx="5731510" cy="3222625"/>
                           </a:xfrm>
                           <a:prstGeom prst="rect">
                             <a:avLst/>
@@ -5071,27 +5242,6 @@
               </w:drawing>
             </w:r>
           </w:p>
-          <w:p>
-            <w:pPr>
-              <w:rPr>
-                <w:rFonts w:ascii="Times New Roman" w:hAnsi="Times New Roman" w:cs="Times New Roman"/>
-              </w:rPr>
-            </w:pPr>
-          </w:p>
-          <w:p>
-            <w:pPr>
-              <w:rPr>
-                <w:rFonts w:ascii="Times New Roman" w:hAnsi="Times New Roman" w:cs="Times New Roman"/>
-              </w:rPr>
-            </w:pPr>
-          </w:p>
-          <w:p>
-            <w:pPr>
-              <w:rPr>
-                <w:rFonts w:ascii="Times New Roman" w:hAnsi="Times New Roman" w:cs="Times New Roman"/>
-              </w:rPr>
-            </w:pPr>
-          </w:p>
         </w:tc>
       </w:tr>
     </w:tbl>
@@ -5110,7 +5260,6 @@
           <w:sz w:val="20"/>
           <w:szCs w:val="20"/>
         </w:rPr>
-        <w:lastRenderedPageBreak/>
         <w:t>②</w:t>
       </w:r>
       <w:r>
@@ -5410,23 +5559,12 @@
                 <w:sz w:val="18"/>
                 <w:szCs w:val="18"/>
               </w:rPr>
-              <w:t xml:space="preserve"> </w:t>
-            </w:r>
-            <w:r>
-              <w:rPr>
-                <w:rFonts w:ascii="Times New Roman" w:hAnsi="Times New Roman" w:cs="Times New Roman"/>
-                <w:i/>
-                <w:iCs/>
-                <w:noProof/>
-                <w:color w:val="999999"/>
-                <w:sz w:val="18"/>
-                <w:szCs w:val="18"/>
-              </w:rPr>
+              <w:lastRenderedPageBreak/>
               <w:drawing>
-                <wp:inline distT="0" distB="0" distL="0" distR="0" wp14:anchorId="2369E69B" wp14:editId="30C098EF">
-                  <wp:extent cx="5731510" cy="3220085"/>
+                <wp:inline distT="0" distB="0" distL="0" distR="0" wp14:anchorId="1EFD8318" wp14:editId="7E9AED4E">
+                  <wp:extent cx="5731510" cy="3222625"/>
                   <wp:effectExtent l="0" t="0" r="2540" b="0"/>
-                  <wp:docPr id="601654062" name="Picture 1"/>
+                  <wp:docPr id="493055472" name="Picture 1"/>
                   <wp:cNvGraphicFramePr>
                     <a:graphicFrameLocks xmlns:a="http://schemas.openxmlformats.org/drawingml/2006/main" noChangeAspect="1"/>
                   </wp:cNvGraphicFramePr>
@@ -5434,7 +5572,7 @@
                     <a:graphicData uri="http://schemas.openxmlformats.org/drawingml/2006/picture">
                       <pic:pic xmlns:pic="http://schemas.openxmlformats.org/drawingml/2006/picture">
                         <pic:nvPicPr>
-                          <pic:cNvPr id="601654062" name=""/>
+                          <pic:cNvPr id="493055472" name=""/>
                           <pic:cNvPicPr/>
                         </pic:nvPicPr>
                         <pic:blipFill>
@@ -5446,7 +5584,7 @@
                         <pic:spPr>
                           <a:xfrm>
                             <a:off x="0" y="0"/>
-                            <a:ext cx="5731510" cy="3220085"/>
+                            <a:ext cx="5731510" cy="3222625"/>
                           </a:xfrm>
                           <a:prstGeom prst="rect">
                             <a:avLst/>
@@ -5458,13 +5596,6 @@
                 </wp:inline>
               </w:drawing>
             </w:r>
-          </w:p>
-          <w:p>
-            <w:pPr>
-              <w:rPr>
-                <w:rFonts w:ascii="Times New Roman" w:hAnsi="Times New Roman" w:cs="Times New Roman"/>
-              </w:rPr>
-            </w:pPr>
           </w:p>
         </w:tc>
       </w:tr>
@@ -5603,17 +5734,47 @@
                 <w:i/>
                 <w:iCs/>
               </w:rPr>
-              <w:t>‘,’</w:t>
-            </w:r>
-            <w:r>
-              <w:rPr>
-                <w:rFonts w:ascii="Times New Roman" w:hAnsi="Times New Roman" w:cs="Times New Roman"/>
-                <w:b/>
-                <w:bCs/>
-                <w:i/>
-                <w:iCs/>
-              </w:rPr>
-              <w:t xml:space="preserve"> -f 5</w:t>
+              <w:t>'</w:t>
+            </w:r>
+            <w:r>
+              <w:rPr>
+                <w:rFonts w:ascii="Times New Roman" w:hAnsi="Times New Roman" w:cs="Times New Roman"/>
+                <w:b/>
+                <w:bCs/>
+                <w:i/>
+                <w:iCs/>
+              </w:rPr>
+              <w:t>,</w:t>
+            </w:r>
+            <w:r>
+              <w:rPr>
+                <w:rFonts w:ascii="Times New Roman" w:hAnsi="Times New Roman" w:cs="Times New Roman"/>
+                <w:b/>
+                <w:bCs/>
+                <w:i/>
+                <w:iCs/>
+              </w:rPr>
+              <w:t>'</w:t>
+            </w:r>
+            <w:r>
+              <w:rPr>
+                <w:rFonts w:ascii="Times New Roman" w:hAnsi="Times New Roman" w:cs="Times New Roman"/>
+                <w:b/>
+                <w:bCs/>
+                <w:i/>
+                <w:iCs/>
+              </w:rPr>
+              <w:t xml:space="preserve"> </w:t>
+            </w:r>
+            <w:r>
+              <w:rPr>
+                <w:rFonts w:ascii="Times New Roman" w:hAnsi="Times New Roman" w:cs="Times New Roman"/>
+                <w:b/>
+                <w:bCs/>
+                <w:i/>
+                <w:iCs/>
+              </w:rPr>
+              <w:t>-f 5</w:t>
             </w:r>
             <w:r>
               <w:rPr>
@@ -5657,47 +5818,19 @@
                 <w:i/>
                 <w:iCs/>
               </w:rPr>
-              <w:t>‘</w:t>
-            </w:r>
-            <w:r>
-              <w:rPr>
-                <w:rFonts w:ascii="Times New Roman" w:hAnsi="Times New Roman" w:cs="Times New Roman"/>
-                <w:b/>
-                <w:bCs/>
-                <w:i/>
-                <w:iCs/>
-              </w:rPr>
-              <w:t>A-</w:t>
-            </w:r>
-            <w:proofErr w:type="gramStart"/>
-            <w:r>
-              <w:rPr>
-                <w:rFonts w:ascii="Times New Roman" w:hAnsi="Times New Roman" w:cs="Times New Roman"/>
-                <w:b/>
-                <w:bCs/>
-                <w:i/>
-                <w:iCs/>
-              </w:rPr>
-              <w:t>Z</w:t>
-            </w:r>
-            <w:r>
-              <w:rPr>
-                <w:rFonts w:ascii="Times New Roman" w:hAnsi="Times New Roman" w:cs="Times New Roman"/>
-                <w:b/>
-                <w:bCs/>
-                <w:i/>
-                <w:iCs/>
-              </w:rPr>
-              <w:t>’</w:t>
-            </w:r>
-            <w:r>
-              <w:rPr>
-                <w:rFonts w:ascii="Times New Roman" w:hAnsi="Times New Roman" w:cs="Times New Roman"/>
-                <w:b/>
-                <w:bCs/>
-                <w:i/>
-                <w:iCs/>
-              </w:rPr>
+              <w:t>'</w:t>
+            </w:r>
+            <w:r>
+              <w:rPr>
+                <w:rFonts w:ascii="Times New Roman" w:hAnsi="Times New Roman" w:cs="Times New Roman"/>
+                <w:b/>
+                <w:bCs/>
+                <w:i/>
+                <w:iCs/>
+              </w:rPr>
+              <w:t>A-Z</w:t>
+            </w:r>
+            <w:r>
               <w:t xml:space="preserve"> </w:t>
             </w:r>
             <w:r>
@@ -5708,9 +5841,28 @@
                 <w:i/>
                 <w:iCs/>
               </w:rPr>
-              <w:t>‘</w:t>
-            </w:r>
-            <w:proofErr w:type="gramEnd"/>
+              <w:t>'</w:t>
+            </w:r>
+            <w:r>
+              <w:rPr>
+                <w:rFonts w:ascii="Times New Roman" w:hAnsi="Times New Roman" w:cs="Times New Roman"/>
+                <w:b/>
+                <w:bCs/>
+                <w:i/>
+                <w:iCs/>
+              </w:rPr>
+              <w:t xml:space="preserve"> </w:t>
+            </w:r>
+            <w:r>
+              <w:rPr>
+                <w:rFonts w:ascii="Times New Roman" w:hAnsi="Times New Roman" w:cs="Times New Roman"/>
+                <w:b/>
+                <w:bCs/>
+                <w:i/>
+                <w:iCs/>
+              </w:rPr>
+              <w:t>'</w:t>
+            </w:r>
             <w:r>
               <w:rPr>
                 <w:rFonts w:ascii="Times New Roman" w:hAnsi="Times New Roman" w:cs="Times New Roman"/>
@@ -5729,7 +5881,7 @@
                 <w:i/>
                 <w:iCs/>
               </w:rPr>
-              <w:t>’</w:t>
+              <w:t>'</w:t>
             </w:r>
             <w:r>
               <w:rPr>
@@ -5924,20 +6076,6 @@
               <w:t xml:space="preserve"> which is the most common product.</w:t>
             </w:r>
           </w:p>
-          <w:p>
-            <w:pPr>
-              <w:rPr>
-                <w:rFonts w:ascii="Times New Roman" w:hAnsi="Times New Roman" w:cs="Times New Roman"/>
-              </w:rPr>
-            </w:pPr>
-          </w:p>
-          <w:p>
-            <w:pPr>
-              <w:rPr>
-                <w:rFonts w:ascii="Times New Roman" w:hAnsi="Times New Roman" w:cs="Times New Roman"/>
-              </w:rPr>
-            </w:pPr>
-          </w:p>
         </w:tc>
       </w:tr>
     </w:tbl>
@@ -5953,7 +6091,6 @@
         <w:rPr>
           <w:rFonts w:ascii="Times New Roman" w:hAnsi="Times New Roman" w:cs="Times New Roman"/>
         </w:rPr>
-        <w:lastRenderedPageBreak/>
         <w:t>Q1</w:t>
       </w:r>
       <w:r>
@@ -6083,17 +6220,13 @@
             <w:r>
               <w:rPr>
                 <w:rFonts w:ascii="Times New Roman" w:hAnsi="Times New Roman" w:cs="Times New Roman"/>
-                <w:i/>
-                <w:iCs/>
-                <w:color w:val="999999"/>
-                <w:sz w:val="18"/>
-                <w:szCs w:val="18"/>
-              </w:rPr>
+              </w:rPr>
+              <w:lastRenderedPageBreak/>
               <w:drawing>
-                <wp:inline distT="0" distB="0" distL="0" distR="0" wp14:anchorId="00C95F02" wp14:editId="484E8A18">
-                  <wp:extent cx="5731510" cy="3221355"/>
+                <wp:inline distT="0" distB="0" distL="0" distR="0" wp14:anchorId="6C815D40" wp14:editId="39E36327">
+                  <wp:extent cx="5731510" cy="3222625"/>
                   <wp:effectExtent l="0" t="0" r="2540" b="0"/>
-                  <wp:docPr id="736483390" name="Picture 1"/>
+                  <wp:docPr id="1784073229" name="Picture 1"/>
                   <wp:cNvGraphicFramePr>
                     <a:graphicFrameLocks xmlns:a="http://schemas.openxmlformats.org/drawingml/2006/main" noChangeAspect="1"/>
                   </wp:cNvGraphicFramePr>
@@ -6101,7 +6234,7 @@
                     <a:graphicData uri="http://schemas.openxmlformats.org/drawingml/2006/picture">
                       <pic:pic xmlns:pic="http://schemas.openxmlformats.org/drawingml/2006/picture">
                         <pic:nvPicPr>
-                          <pic:cNvPr id="736483390" name=""/>
+                          <pic:cNvPr id="1784073229" name=""/>
                           <pic:cNvPicPr/>
                         </pic:nvPicPr>
                         <pic:blipFill>
@@ -6113,7 +6246,7 @@
                         <pic:spPr>
                           <a:xfrm>
                             <a:off x="0" y="0"/>
-                            <a:ext cx="5731510" cy="3221355"/>
+                            <a:ext cx="5731510" cy="3222625"/>
                           </a:xfrm>
                           <a:prstGeom prst="rect">
                             <a:avLst/>
@@ -6125,13 +6258,6 @@
                 </wp:inline>
               </w:drawing>
             </w:r>
-          </w:p>
-          <w:p>
-            <w:pPr>
-              <w:rPr>
-                <w:rFonts w:ascii="Times New Roman" w:hAnsi="Times New Roman" w:cs="Times New Roman"/>
-              </w:rPr>
-            </w:pPr>
           </w:p>
         </w:tc>
       </w:tr>
@@ -6221,7 +6347,67 @@
                 <w:i/>
                 <w:iCs/>
               </w:rPr>
-              <w:t>awk -F ',' 'NR &gt; 1 &amp;&amp; $9 == "cancelled" &amp;&amp; $</w:t>
+              <w:t xml:space="preserve">awk -F </w:t>
+            </w:r>
+            <w:r>
+              <w:rPr>
+                <w:rFonts w:ascii="Times New Roman" w:hAnsi="Times New Roman" w:cs="Times New Roman"/>
+                <w:b/>
+                <w:bCs/>
+                <w:i/>
+                <w:iCs/>
+              </w:rPr>
+              <w:t>'</w:t>
+            </w:r>
+            <w:r>
+              <w:rPr>
+                <w:rFonts w:ascii="Times New Roman" w:hAnsi="Times New Roman" w:cs="Times New Roman"/>
+                <w:b/>
+                <w:bCs/>
+                <w:i/>
+                <w:iCs/>
+              </w:rPr>
+              <w:t>,</w:t>
+            </w:r>
+            <w:r>
+              <w:rPr>
+                <w:rFonts w:ascii="Times New Roman" w:hAnsi="Times New Roman" w:cs="Times New Roman"/>
+                <w:b/>
+                <w:bCs/>
+                <w:i/>
+                <w:iCs/>
+              </w:rPr>
+              <w:t>'</w:t>
+            </w:r>
+            <w:r>
+              <w:rPr>
+                <w:rFonts w:ascii="Times New Roman" w:hAnsi="Times New Roman" w:cs="Times New Roman"/>
+                <w:b/>
+                <w:bCs/>
+                <w:i/>
+                <w:iCs/>
+              </w:rPr>
+              <w:t xml:space="preserve"> </w:t>
+            </w:r>
+            <w:r>
+              <w:rPr>
+                <w:rFonts w:ascii="Times New Roman" w:hAnsi="Times New Roman" w:cs="Times New Roman"/>
+                <w:b/>
+                <w:bCs/>
+                <w:i/>
+                <w:iCs/>
+              </w:rPr>
+              <w:t>'</w:t>
+            </w:r>
+            <w:r>
+              <w:rPr>
+                <w:rFonts w:ascii="Times New Roman" w:hAnsi="Times New Roman" w:cs="Times New Roman"/>
+                <w:b/>
+                <w:bCs/>
+                <w:i/>
+                <w:iCs/>
+              </w:rPr>
+              <w:t>NR &gt; 1 &amp;&amp; $9 == "cancelled" &amp;&amp; $</w:t>
             </w:r>
             <w:proofErr w:type="gramStart"/>
             <w:r>
@@ -6276,7 +6462,20 @@
                 <w:i/>
                 <w:iCs/>
               </w:rPr>
-              <w:t>total}'</w:t>
+              <w:t>total}</w:t>
+            </w:r>
+            <w:r>
+              <w:t xml:space="preserve"> </w:t>
+            </w:r>
+            <w:r>
+              <w:rPr>
+                <w:rFonts w:ascii="Times New Roman" w:hAnsi="Times New Roman" w:cs="Times New Roman"/>
+                <w:b/>
+                <w:bCs/>
+                <w:i/>
+                <w:iCs/>
+              </w:rPr>
+              <w:t>'</w:t>
             </w:r>
             <w:proofErr w:type="gramEnd"/>
             <w:r>
@@ -6311,19 +6510,7 @@
               <w:rPr>
                 <w:rFonts w:ascii="Times New Roman" w:hAnsi="Times New Roman" w:cs="Times New Roman"/>
               </w:rPr>
-              <w:t xml:space="preserve">The </w:t>
-            </w:r>
-            <w:r>
-              <w:rPr>
-                <w:rFonts w:ascii="Times New Roman" w:hAnsi="Times New Roman" w:cs="Times New Roman"/>
-              </w:rPr>
-              <w:t>flag</w:t>
-            </w:r>
-            <w:r>
-              <w:rPr>
-                <w:rFonts w:ascii="Times New Roman" w:hAnsi="Times New Roman" w:cs="Times New Roman"/>
-              </w:rPr>
-              <w:t xml:space="preserve"> </w:t>
+              <w:t xml:space="preserve">The flag </w:t>
             </w:r>
             <w:r>
               <w:rPr>
@@ -6346,26 +6533,14 @@
               <w:rPr>
                 <w:rFonts w:ascii="Times New Roman" w:hAnsi="Times New Roman" w:cs="Times New Roman"/>
               </w:rPr>
-              <w:t>comma</w:t>
-            </w:r>
-            <w:r>
-              <w:rPr>
-                <w:rFonts w:ascii="Times New Roman" w:hAnsi="Times New Roman" w:cs="Times New Roman"/>
-              </w:rPr>
-              <w:t xml:space="preserve"> ‘,</w:t>
+              <w:t>comma ‘,</w:t>
             </w:r>
             <w:proofErr w:type="gramEnd"/>
             <w:r>
               <w:rPr>
                 <w:rFonts w:ascii="Times New Roman" w:hAnsi="Times New Roman" w:cs="Times New Roman"/>
               </w:rPr>
-              <w:t>’</w:t>
-            </w:r>
-            <w:r>
-              <w:rPr>
-                <w:rFonts w:ascii="Times New Roman" w:hAnsi="Times New Roman" w:cs="Times New Roman"/>
-              </w:rPr>
-              <w:t xml:space="preserve"> as the field separator.</w:t>
+              <w:t>’ as the field separator.</w:t>
             </w:r>
           </w:p>
           <w:p>
@@ -6427,63 +6602,33 @@
                 <w:i/>
                 <w:iCs/>
               </w:rPr>
-              <w:t xml:space="preserve">$9 </w:t>
-            </w:r>
-            <w:r>
-              <w:rPr>
-                <w:rFonts w:ascii="Times New Roman" w:hAnsi="Times New Roman" w:cs="Times New Roman"/>
-                <w:b/>
-                <w:bCs/>
-                <w:i/>
-                <w:iCs/>
-              </w:rPr>
-              <w:t>=</w:t>
-            </w:r>
-            <w:r>
-              <w:rPr>
-                <w:rFonts w:ascii="Times New Roman" w:hAnsi="Times New Roman" w:cs="Times New Roman"/>
-                <w:b/>
-                <w:bCs/>
-                <w:i/>
-                <w:iCs/>
-              </w:rPr>
-              <w:t xml:space="preserve">= </w:t>
-            </w:r>
-            <w:r>
-              <w:rPr>
-                <w:rFonts w:ascii="Times New Roman" w:hAnsi="Times New Roman" w:cs="Times New Roman"/>
-                <w:b/>
-                <w:bCs/>
-                <w:i/>
-                <w:iCs/>
-              </w:rPr>
-              <w:t>“</w:t>
-            </w:r>
-            <w:r>
-              <w:rPr>
-                <w:rFonts w:ascii="Times New Roman" w:hAnsi="Times New Roman" w:cs="Times New Roman"/>
-                <w:b/>
-                <w:bCs/>
-                <w:i/>
-                <w:iCs/>
-              </w:rPr>
-              <w:t>cancelled</w:t>
-            </w:r>
-            <w:r>
-              <w:rPr>
-                <w:rFonts w:ascii="Times New Roman" w:hAnsi="Times New Roman" w:cs="Times New Roman"/>
-                <w:b/>
-                <w:bCs/>
-                <w:i/>
-                <w:iCs/>
-              </w:rPr>
-              <w:t>”</w:t>
-            </w:r>
-            <w:r>
-              <w:rPr>
-                <w:rFonts w:ascii="Times New Roman" w:hAnsi="Times New Roman" w:cs="Times New Roman"/>
-              </w:rPr>
-              <w:t xml:space="preserve"> selects only orders whose status is cancelled.</w:t>
+              <w:t xml:space="preserve">$9 == </w:t>
+            </w:r>
+            <w:r>
+              <w:rPr>
+                <w:rFonts w:ascii="Times New Roman" w:hAnsi="Times New Roman" w:cs="Times New Roman"/>
+                <w:b/>
+                <w:bCs/>
+                <w:i/>
+                <w:iCs/>
+              </w:rPr>
+              <w:t>"cancelled"</w:t>
+            </w:r>
+            <w:r>
+              <w:rPr>
+                <w:rFonts w:ascii="Times New Roman" w:hAnsi="Times New Roman" w:cs="Times New Roman"/>
+                <w:b/>
+                <w:bCs/>
+                <w:i/>
+                <w:iCs/>
+              </w:rPr>
+              <w:t xml:space="preserve"> </w:t>
+            </w:r>
+            <w:r>
+              <w:rPr>
+                <w:rFonts w:ascii="Times New Roman" w:hAnsi="Times New Roman" w:cs="Times New Roman"/>
+              </w:rPr>
+              <w:t>selects only orders whose status is cancelled.</w:t>
             </w:r>
           </w:p>
           <w:p>
@@ -6522,7 +6667,17 @@
                 <w:i/>
                 <w:iCs/>
               </w:rPr>
-              <w:t>8 !</w:t>
+              <w:t xml:space="preserve">8 != </w:t>
+            </w:r>
+            <w:r>
+              <w:rPr>
+                <w:rFonts w:ascii="Times New Roman" w:hAnsi="Times New Roman" w:cs="Times New Roman"/>
+                <w:b/>
+                <w:bCs/>
+                <w:i/>
+                <w:iCs/>
+              </w:rPr>
+              <w:t>""</w:t>
             </w:r>
             <w:proofErr w:type="gramEnd"/>
             <w:r>
@@ -6533,23 +6688,13 @@
                 <w:i/>
                 <w:iCs/>
               </w:rPr>
-              <w:t xml:space="preserve">= </w:t>
-            </w:r>
-            <w:r>
-              <w:rPr>
-                <w:rFonts w:ascii="Times New Roman" w:hAnsi="Times New Roman" w:cs="Times New Roman"/>
-                <w:b/>
-                <w:bCs/>
-                <w:i/>
-                <w:iCs/>
-              </w:rPr>
-              <w:t>“”</w:t>
-            </w:r>
-            <w:r>
-              <w:rPr>
-                <w:rFonts w:ascii="Times New Roman" w:hAnsi="Times New Roman" w:cs="Times New Roman"/>
-              </w:rPr>
-              <w:t xml:space="preserve"> skips rows with a missing unit price.</w:t>
+              <w:t xml:space="preserve"> </w:t>
+            </w:r>
+            <w:r>
+              <w:rPr>
+                <w:rFonts w:ascii="Times New Roman" w:hAnsi="Times New Roman" w:cs="Times New Roman"/>
+              </w:rPr>
+              <w:t>skips rows with a missing unit price.</w:t>
             </w:r>
           </w:p>
           <w:p>
@@ -6804,18 +6949,13 @@
             <w:r>
               <w:rPr>
                 <w:rFonts w:ascii="Times New Roman" w:hAnsi="Times New Roman" w:cs="Times New Roman"/>
-                <w:i/>
-                <w:iCs/>
-                <w:color w:val="999999"/>
-                <w:sz w:val="18"/>
-                <w:szCs w:val="18"/>
               </w:rPr>
               <w:lastRenderedPageBreak/>
               <w:drawing>
-                <wp:inline distT="0" distB="0" distL="0" distR="0" wp14:anchorId="05B7839E" wp14:editId="6C40FD57">
-                  <wp:extent cx="5731510" cy="3233420"/>
-                  <wp:effectExtent l="0" t="0" r="2540" b="5080"/>
-                  <wp:docPr id="1816456314" name="Picture 1"/>
+                <wp:inline distT="0" distB="0" distL="0" distR="0" wp14:anchorId="5E4D446A" wp14:editId="5546870D">
+                  <wp:extent cx="5731510" cy="3222625"/>
+                  <wp:effectExtent l="0" t="0" r="2540" b="0"/>
+                  <wp:docPr id="871782007" name="Picture 1"/>
                   <wp:cNvGraphicFramePr>
                     <a:graphicFrameLocks xmlns:a="http://schemas.openxmlformats.org/drawingml/2006/main" noChangeAspect="1"/>
                   </wp:cNvGraphicFramePr>
@@ -6823,7 +6963,7 @@
                     <a:graphicData uri="http://schemas.openxmlformats.org/drawingml/2006/picture">
                       <pic:pic xmlns:pic="http://schemas.openxmlformats.org/drawingml/2006/picture">
                         <pic:nvPicPr>
-                          <pic:cNvPr id="1816456314" name=""/>
+                          <pic:cNvPr id="871782007" name=""/>
                           <pic:cNvPicPr/>
                         </pic:nvPicPr>
                         <pic:blipFill>
@@ -6835,7 +6975,7 @@
                         <pic:spPr>
                           <a:xfrm>
                             <a:off x="0" y="0"/>
-                            <a:ext cx="5731510" cy="3233420"/>
+                            <a:ext cx="5731510" cy="3222625"/>
                           </a:xfrm>
                           <a:prstGeom prst="rect">
                             <a:avLst/>
@@ -7304,20 +7444,6 @@
               </w:rPr>
               <w:t xml:space="preserve"> Uses awk with a comma as the field separator. It skips the header (NR &gt; 1), selects rows whose status in column 9 is shipped, skips rows with an empty unit price in column 8, multiplies the unit price ($8) by the quantity ($7), accumulates the revenue in total, and prints the total after processing all rows.</w:t>
             </w:r>
-          </w:p>
-          <w:p>
-            <w:pPr>
-              <w:rPr>
-                <w:rFonts w:ascii="Times New Roman" w:hAnsi="Times New Roman" w:cs="Times New Roman"/>
-              </w:rPr>
-            </w:pPr>
-          </w:p>
-          <w:p>
-            <w:pPr>
-              <w:rPr>
-                <w:rFonts w:ascii="Times New Roman" w:hAnsi="Times New Roman" w:cs="Times New Roman"/>
-              </w:rPr>
-            </w:pPr>
           </w:p>
         </w:tc>
       </w:tr>
@@ -10142,7 +10268,6 @@
   <w:style w:type="character" w:default="1" w:styleId="DefaultParagraphFont">
     <w:name w:val="Default Paragraph Font"/>
     <w:uiPriority w:val="1"/>
-    <w:semiHidden/>
     <w:unhideWhenUsed/>
   </w:style>
   <w:style w:type="table" w:default="1" w:styleId="TableNormal">

</xml_diff>